<commit_message>
Poprawa nazw w podpunkcie 4.1.2
</commit_message>
<xml_diff>
--- a/TC(p. 4.1)/TC(p.4.1).docx
+++ b/TC(p. 4.1)/TC(p.4.1).docx
@@ -695,7 +695,7 @@
           <w:lang w:eastAsia="pl-PL"/>
           <w14:ligatures w14:val="none"/>
         </w:rPr>
-        <w:t>Klient</w:t>
+        <w:t>Użytkownik zalogowany</w:t>
       </w:r>
     </w:p>
     <w:p>
@@ -745,7 +745,17 @@
           <w:lang w:eastAsia="pl-PL"/>
           <w14:ligatures w14:val="none"/>
         </w:rPr>
-        <w:t>Klient wybiera dostępnego chomika i składa wniosek o jego wypożyczenie na określony czas.</w:t>
+        <w:t>Użytkownik</w:t>
+      </w:r>
+      <w:r>
+        <w:rPr>
+          <w:rFonts w:ascii="Arial" w:eastAsia="Times New Roman" w:hAnsi="Arial" w:cs="Arial"/>
+          <w:color w:val="000000"/>
+          <w:kern w:val="0"/>
+          <w:lang w:eastAsia="pl-PL"/>
+          <w14:ligatures w14:val="none"/>
+        </w:rPr>
+        <w:t xml:space="preserve"> wybiera dostępnego chomika i składa wniosek o jego wypożyczenie na określony czas.</w:t>
       </w:r>
     </w:p>
     <w:p>
@@ -798,7 +808,17 @@
           <w:lang w:eastAsia="pl-PL"/>
           <w14:ligatures w14:val="none"/>
         </w:rPr>
-        <w:t>Klient loguje się do systemu</w:t>
+        <w:t xml:space="preserve">Użytkownik </w:t>
+      </w:r>
+      <w:r>
+        <w:rPr>
+          <w:rFonts w:ascii="Arial" w:eastAsia="Times New Roman" w:hAnsi="Arial" w:cs="Arial"/>
+          <w:color w:val="000000"/>
+          <w:kern w:val="0"/>
+          <w:lang w:eastAsia="pl-PL"/>
+          <w14:ligatures w14:val="none"/>
+        </w:rPr>
+        <w:t>loguje się do systemu</w:t>
       </w:r>
     </w:p>
     <w:p>
@@ -1915,7 +1935,7 @@
           <w:lang w:eastAsia="pl-PL"/>
           <w14:ligatures w14:val="none"/>
         </w:rPr>
-        <w:t>niezalogowany użytkownik</w:t>
+        <w:t>Użytkownik niezalogowany</w:t>
       </w:r>
     </w:p>
     <w:p>
@@ -2499,7 +2519,7 @@
           <w:lang w:eastAsia="pl-PL"/>
           <w14:ligatures w14:val="none"/>
         </w:rPr>
-        <w:t>Klient </w:t>
+        <w:t>Użytkownik zalogowany</w:t>
       </w:r>
     </w:p>
     <w:p>
@@ -2549,7 +2569,17 @@
           <w:lang w:eastAsia="pl-PL"/>
           <w14:ligatures w14:val="none"/>
         </w:rPr>
-        <w:t>Klient rezygnuje z wcześniej złożonego wniosku leasingowego.</w:t>
+        <w:t>Użytkownik</w:t>
+      </w:r>
+      <w:r>
+        <w:rPr>
+          <w:rFonts w:ascii="Arial" w:eastAsia="Times New Roman" w:hAnsi="Arial" w:cs="Arial"/>
+          <w:color w:val="000000"/>
+          <w:kern w:val="0"/>
+          <w:lang w:eastAsia="pl-PL"/>
+          <w14:ligatures w14:val="none"/>
+        </w:rPr>
+        <w:t xml:space="preserve"> rezygnuje z wcześniej złożonego wniosku leasingowego.</w:t>
       </w:r>
     </w:p>
     <w:p>
@@ -2602,7 +2632,17 @@
           <w:lang w:eastAsia="pl-PL"/>
           <w14:ligatures w14:val="none"/>
         </w:rPr>
-        <w:t>Klient przechodzi do listy rezerwacji</w:t>
+        <w:t xml:space="preserve">Użytkownik </w:t>
+      </w:r>
+      <w:r>
+        <w:rPr>
+          <w:rFonts w:ascii="Arial" w:eastAsia="Times New Roman" w:hAnsi="Arial" w:cs="Arial"/>
+          <w:color w:val="000000"/>
+          <w:kern w:val="0"/>
+          <w:lang w:eastAsia="pl-PL"/>
+          <w14:ligatures w14:val="none"/>
+        </w:rPr>
+        <w:t>przechodzi do listy rezerwacji</w:t>
       </w:r>
     </w:p>
     <w:p>

</xml_diff>